<commit_message>
Ground Chapter 2 baseline in observed Chapter 1 approach
</commit_message>
<xml_diff>
--- a/second-placement/planning/chapter-2-marketing-plan/Chapter-2-Marketing-Plan-Teacher-Guide-v1.docx
+++ b/second-placement/planning/chapter-2-marketing-plan/Chapter-2-Marketing-Plan-Teacher-Guide-v1.docx
@@ -20,7 +20,7 @@
     </w:p>
     <w:p>
       <w:r>
-        <w:t>Planning status: v1 for Piter/SBTE review. No class dates, Teams assignment, quiz date, project choice, or submission rule is asserted here.</w:t>
+        <w:t>Phase 1: Chapter 1-style Chapter 2 baseline for independent Viber review. Nine sessions are planning segments, not fixed dates or proof of completion. Chapter 2 Teams files, graded work, quiz, project, and test remain unconfirmed.</w:t>
       </w:r>
     </w:p>
     <w:p>
@@ -44,7 +44,7 @@
         <w:pStyle w:val="ListBullet"/>
       </w:pPr>
       <w:r>
-        <w:t>The 42-minute clock is a planning rail, not a claim that a page or task has been completed. Record the actual stop and carry forward unfinished reading.</w:t>
+        <w:t>The 42-minute clock is an illustrative planning rail, not an observed fixed Chapter 1 formula. Protect the actual reading/work stop and resume it in the next block.</w:t>
       </w:r>
     </w:p>
     <w:p>
@@ -60,7 +60,7 @@
         <w:pStyle w:val="ListBullet"/>
       </w:pPr>
       <w:r>
-        <w:t>This is the “what we did in Chapter 1” version. A later, separate version can examine UofR-informed changes and section-specific teaching after this baseline is reviewed.</w:t>
+        <w:t>This records the Chapter 1 approach as a control baseline. Warner/UofR-informed changes belong to a separate Phase 2 after independent review.</w:t>
       </w:r>
     </w:p>
     <w:p>
@@ -68,7 +68,7 @@
         <w:pStyle w:val="Heading1"/>
       </w:pPr>
       <w:r>
-        <w:t>The Chapter 1 routine we are carrying forward</w:t>
+        <w:t>Chapter 1 instructional pattern and evidence state</w:t>
       </w:r>
     </w:p>
     <w:tbl>
@@ -80,53 +80,41 @@
         <w:tblLook w:firstColumn="1" w:firstRow="1" w:lastColumn="0" w:lastRow="0" w:noHBand="0" w:noVBand="1" w:val="04A0"/>
       </w:tblPr>
       <w:tblGrid>
-        <w:gridCol w:w="691"/>
-        <w:gridCol w:w="3960"/>
-        <w:gridCol w:w="5256"/>
+        <w:gridCol w:w="1440"/>
+        <w:gridCol w:w="3672"/>
+        <w:gridCol w:w="4795"/>
       </w:tblGrid>
       <w:tr>
         <w:tc>
           <w:tcPr>
-            <w:tcW w:type="dxa" w:w="691"/>
+            <w:tcW w:type="dxa" w:w="1440"/>
             <w:shd w:fill="DCE9EE"/>
           </w:tcPr>
           <w:p>
             <w:r>
-              <w:rPr>
-                <w:b/>
-                <w:sz w:val="17"/>
-              </w:rPr>
-              <w:t>Order</w:t>
-            </w:r>
-          </w:p>
-        </w:tc>
-        <w:tc>
-          <w:tcPr>
-            <w:tcW w:type="dxa" w:w="3960"/>
+              <w:t>State</w:t>
+            </w:r>
+          </w:p>
+        </w:tc>
+        <w:tc>
+          <w:tcPr>
+            <w:tcW w:type="dxa" w:w="3672"/>
             <w:shd w:fill="DCE9EE"/>
           </w:tcPr>
           <w:p>
             <w:r>
-              <w:rPr>
-                <w:b/>
-                <w:sz w:val="17"/>
-              </w:rPr>
-              <w:t>Observed Chapter 1 move</w:t>
-            </w:r>
-          </w:p>
-        </w:tc>
-        <w:tc>
-          <w:tcPr>
-            <w:tcW w:type="dxa" w:w="5256"/>
+              <w:t>Chapter 1 practice</w:t>
+            </w:r>
+          </w:p>
+        </w:tc>
+        <w:tc>
+          <w:tcPr>
+            <w:tcW w:type="dxa" w:w="4795"/>
             <w:shd w:fill="DCE9EE"/>
           </w:tcPr>
           <w:p>
             <w:r>
-              <w:rPr>
-                <w:b/>
-                <w:sz w:val="17"/>
-              </w:rPr>
-              <w:t>Chapter 2 equivalent</w:t>
+              <w:t>Chapter 2 transfer</w:t>
             </w:r>
           </w:p>
         </w:tc>
@@ -134,52 +122,34 @@
       <w:tr>
         <w:tc>
           <w:tcPr>
-            <w:tcW w:type="dxa" w:w="691"/>
+            <w:tcW w:type="dxa" w:w="1440"/>
             <w:vAlign w:val="center"/>
           </w:tcPr>
           <w:p>
-            <w:pPr>
-              <w:spacing w:after="20"/>
-            </w:pPr>
-            <w:r>
-              <w:rPr>
-                <w:sz w:val="16"/>
-              </w:rPr>
-              <w:t>1</w:t>
-            </w:r>
-          </w:p>
-        </w:tc>
-        <w:tc>
-          <w:tcPr>
-            <w:tcW w:type="dxa" w:w="3960"/>
+            <w:r>
+              <w:t>School</w:t>
+            </w:r>
+          </w:p>
+        </w:tc>
+        <w:tc>
+          <w:tcPr>
+            <w:tcW w:type="dxa" w:w="3672"/>
             <w:vAlign w:val="center"/>
           </w:tcPr>
           <w:p>
-            <w:pPr>
-              <w:spacing w:after="20"/>
-            </w:pPr>
-            <w:r>
-              <w:rPr>
-                <w:sz w:val="16"/>
-              </w:rPr>
-              <w:t>Agenda/attendance; students open textbook, notes, Terms to Know, and saved course folder.</w:t>
-            </w:r>
-          </w:p>
-        </w:tc>
-        <w:tc>
-          <w:tcPr>
-            <w:tcW w:type="dxa" w:w="5256"/>
+            <w:r>
+              <w:t>Attendance and agenda; open saved textbook, notes, Terms to Know, and Marketing folder. Late arrivals re-enter the current task.</w:t>
+            </w:r>
+          </w:p>
+        </w:tc>
+        <w:tc>
+          <w:tcPr>
+            <w:tcW w:type="dxa" w:w="4795"/>
             <w:vAlign w:val="center"/>
           </w:tcPr>
           <w:p>
-            <w:pPr>
-              <w:spacing w:after="20"/>
-            </w:pPr>
-            <w:r>
-              <w:rPr>
-                <w:sz w:val="16"/>
-              </w:rPr>
-              <w:t>Display today’s printed pages and required files; check access while taking attendance.</w:t>
+            <w:r>
+              <w:t>Check each block's actual stop and file access; do not claim Chapter 2 Teams materials are posted.</w:t>
             </w:r>
           </w:p>
         </w:tc>
@@ -187,52 +157,34 @@
       <w:tr>
         <w:tc>
           <w:tcPr>
-            <w:tcW w:type="dxa" w:w="691"/>
+            <w:tcW w:type="dxa" w:w="1440"/>
             <w:vAlign w:val="center"/>
           </w:tcPr>
           <w:p>
-            <w:pPr>
-              <w:spacing w:after="20"/>
-            </w:pPr>
-            <w:r>
-              <w:rPr>
-                <w:sz w:val="16"/>
-              </w:rPr>
-              <w:t>2</w:t>
-            </w:r>
-          </w:p>
-        </w:tc>
-        <w:tc>
-          <w:tcPr>
-            <w:tcW w:type="dxa" w:w="3960"/>
+            <w:r>
+              <w:t>SBTE</w:t>
+            </w:r>
+          </w:p>
+        </w:tc>
+        <w:tc>
+          <w:tcPr>
+            <w:tcW w:type="dxa" w:w="3672"/>
             <w:vAlign w:val="center"/>
           </w:tcPr>
           <w:p>
-            <w:pPr>
-              <w:spacing w:after="20"/>
-            </w:pPr>
-            <w:r>
-              <w:rPr>
-                <w:sz w:val="16"/>
-              </w:rPr>
-              <w:t>Short scenario/visual question; two or three responses; stop on time.</w:t>
-            </w:r>
-          </w:p>
-        </w:tc>
-        <w:tc>
-          <w:tcPr>
-            <w:tcW w:type="dxa" w:w="5256"/>
+            <w:r>
+              <w:t>Brief concrete opener; take a few responses, then stop. A 30-minute opener displaced reading; the SBTE set a roughly five-minute target.</w:t>
+            </w:r>
+          </w:p>
+        </w:tc>
+        <w:tc>
+          <w:tcPr>
+            <w:tcW w:type="dxa" w:w="4795"/>
             <w:vAlign w:val="center"/>
           </w:tcPr>
           <w:p>
-            <w:pPr>
-              <w:spacing w:after="20"/>
-            </w:pPr>
-            <w:r>
-              <w:rPr>
-                <w:sz w:val="16"/>
-              </w:rPr>
-              <w:t>Ask a concrete marketing-plan question before naming or revealing the new term.</w:t>
+            <w:r>
+              <w:t>Use one short plan decision, a reason, and a hard transition to the source.</w:t>
             </w:r>
           </w:p>
         </w:tc>
@@ -240,52 +192,34 @@
       <w:tr>
         <w:tc>
           <w:tcPr>
-            <w:tcW w:type="dxa" w:w="691"/>
+            <w:tcW w:type="dxa" w:w="1440"/>
             <w:vAlign w:val="center"/>
           </w:tcPr>
           <w:p>
-            <w:pPr>
-              <w:spacing w:after="20"/>
-            </w:pPr>
-            <w:r>
-              <w:rPr>
-                <w:sz w:val="16"/>
-              </w:rPr>
-              <w:t>3</w:t>
-            </w:r>
-          </w:p>
-        </w:tc>
-        <w:tc>
-          <w:tcPr>
-            <w:tcW w:type="dxa" w:w="3960"/>
+            <w:r>
+              <w:t>Observed</w:t>
+            </w:r>
+          </w:p>
+        </w:tc>
+        <w:tc>
+          <w:tcPr>
+            <w:tcW w:type="dxa" w:w="3672"/>
             <w:vAlign w:val="center"/>
           </w:tcPr>
           <w:p>
-            <w:pPr>
-              <w:spacing w:after="20"/>
-            </w:pPr>
-            <w:r>
-              <w:rPr>
-                <w:sz w:val="16"/>
-              </w:rPr>
-              <w:t>SBTE chapter-note slides/discussion first; fill the missing words together.</w:t>
-            </w:r>
-          </w:p>
-        </w:tc>
-        <w:tc>
-          <w:tcPr>
-            <w:tcW w:type="dxa" w:w="5256"/>
+            <w:r>
+              <w:t>Chapter notes/discussion and missing-word completion preceded matching textbook reading in the usual route.</w:t>
+            </w:r>
+          </w:p>
+        </w:tc>
+        <w:tc>
+          <w:tcPr>
+            <w:tcW w:type="dxa" w:w="4795"/>
             <w:vAlign w:val="center"/>
           </w:tcPr>
           <w:p>
-            <w:pPr>
-              <w:spacing w:after="20"/>
-            </w:pPr>
-            <w:r>
-              <w:rPr>
-                <w:sz w:val="16"/>
-              </w:rPr>
-              <w:t>Use Chapter 2 notes keyed to the next headings. If not yet provided, use the headings in this guide as teacher prompts.</w:t>
+            <w:r>
+              <w:t>Use the authorized Chapter 2 notes if supplied; otherwise use textbook headings as teacher prompts, not a fictional approved deck.</w:t>
             </w:r>
           </w:p>
         </w:tc>
@@ -293,52 +227,34 @@
       <w:tr>
         <w:tc>
           <w:tcPr>
-            <w:tcW w:type="dxa" w:w="691"/>
+            <w:tcW w:type="dxa" w:w="1440"/>
             <w:vAlign w:val="center"/>
           </w:tcPr>
           <w:p>
-            <w:pPr>
-              <w:spacing w:after="20"/>
-            </w:pPr>
-            <w:r>
-              <w:rPr>
-                <w:sz w:val="16"/>
-              </w:rPr>
-              <w:t>4</w:t>
-            </w:r>
-          </w:p>
-        </w:tc>
-        <w:tc>
-          <w:tcPr>
-            <w:tcW w:type="dxa" w:w="3960"/>
+            <w:r>
+              <w:t>Observed</w:t>
+            </w:r>
+          </w:p>
+        </w:tc>
+        <w:tc>
+          <w:tcPr>
+            <w:tcW w:type="dxa" w:w="3672"/>
             <w:vAlign w:val="center"/>
           </w:tcPr>
           <w:p>
-            <w:pPr>
-              <w:spacing w:after="20"/>
-            </w:pPr>
-            <w:r>
-              <w:rPr>
-                <w:sz w:val="16"/>
-              </w:rPr>
-              <w:t>Read the matching textbook paragraphs and figures; pause to connect them to notes.</w:t>
-            </w:r>
-          </w:p>
-        </w:tc>
-        <w:tc>
-          <w:tcPr>
-            <w:tcW w:type="dxa" w:w="5256"/>
+            <w:r>
+              <w:t>Read matching pages/figures and ask source-based questions. The class sometimes carried reading forward when discussion or group work took longer.</w:t>
+            </w:r>
+          </w:p>
+        </w:tc>
+        <w:tc>
+          <w:tcPr>
+            <w:tcW w:type="dxa" w:w="4795"/>
             <w:vAlign w:val="center"/>
           </w:tcPr>
           <w:p>
-            <w:pPr>
-              <w:spacing w:after="20"/>
-            </w:pPr>
-            <w:r>
-              <w:rPr>
-                <w:sz w:val="16"/>
-              </w:rPr>
-              <w:t>Read the assigned printed pages, including the figures; do not replace the reading with a slide summary.</w:t>
+            <w:r>
+              <w:t>Read Chapter 2 in printed-page order; record the exact paragraph/figure reached.</w:t>
             </w:r>
           </w:p>
         </w:tc>
@@ -346,52 +262,34 @@
       <w:tr>
         <w:tc>
           <w:tcPr>
-            <w:tcW w:type="dxa" w:w="691"/>
+            <w:tcW w:type="dxa" w:w="1440"/>
             <w:vAlign w:val="center"/>
           </w:tcPr>
           <w:p>
-            <w:pPr>
-              <w:spacing w:after="20"/>
-            </w:pPr>
-            <w:r>
-              <w:rPr>
-                <w:sz w:val="16"/>
-              </w:rPr>
-              <w:t>5</w:t>
-            </w:r>
-          </w:p>
-        </w:tc>
-        <w:tc>
-          <w:tcPr>
-            <w:tcW w:type="dxa" w:w="3960"/>
+            <w:r>
+              <w:t>SBTE</w:t>
+            </w:r>
+          </w:p>
+        </w:tc>
+        <w:tc>
+          <w:tcPr>
+            <w:tcW w:type="dxa" w:w="3672"/>
             <w:vAlign w:val="center"/>
           </w:tcPr>
           <w:p>
-            <w:pPr>
-              <w:spacing w:after="20"/>
-            </w:pPr>
-            <w:r>
-              <w:rPr>
-                <w:sz w:val="16"/>
-              </w:rPr>
-              <w:t>Build Terms to Know digital flashcards as terms appear in the chapter; model the first.</w:t>
-            </w:r>
-          </w:p>
-        </w:tc>
-        <w:tc>
-          <w:tcPr>
-            <w:tcW w:type="dxa" w:w="5256"/>
+            <w:r>
+              <w:t>Model one PowerPoint Terms-to-Know card: term and image first, definition on reveal; students then build cards in book encounter order.</w:t>
+            </w:r>
+          </w:p>
+        </w:tc>
+        <w:tc>
+          <w:tcPr>
+            <w:tcW w:type="dxa" w:w="4795"/>
             <w:vAlign w:val="center"/>
           </w:tcPr>
           <w:p>
-            <w:pPr>
-              <w:spacing w:after="20"/>
-            </w:pPr>
-            <w:r>
-              <w:rPr>
-                <w:sz w:val="16"/>
-              </w:rPr>
-              <w:t>Use the six Chapter 2 key terms in encounter order; one modeled card, then student work.</w:t>
+            <w:r>
+              <w:t>Reuse the Chapter 1 process with the six Chapter 2 terms only after the Chapter 2 task/template is confirmed.</w:t>
             </w:r>
           </w:p>
         </w:tc>
@@ -399,52 +297,34 @@
       <w:tr>
         <w:tc>
           <w:tcPr>
-            <w:tcW w:type="dxa" w:w="691"/>
+            <w:tcW w:type="dxa" w:w="1440"/>
             <w:vAlign w:val="center"/>
           </w:tcPr>
           <w:p>
-            <w:pPr>
-              <w:spacing w:after="20"/>
-            </w:pPr>
-            <w:r>
-              <w:rPr>
-                <w:sz w:val="16"/>
-              </w:rPr>
-              <w:t>6</w:t>
-            </w:r>
-          </w:p>
-        </w:tc>
-        <w:tc>
-          <w:tcPr>
-            <w:tcW w:type="dxa" w:w="3960"/>
+            <w:r>
+              <w:t>School</w:t>
+            </w:r>
+          </w:p>
+        </w:tc>
+        <w:tc>
+          <w:tcPr>
+            <w:tcW w:type="dxa" w:w="3672"/>
             <w:vAlign w:val="center"/>
           </w:tcPr>
           <w:p>
-            <w:pPr>
-              <w:spacing w:after="20"/>
-            </w:pPr>
-            <w:r>
-              <w:rPr>
-                <w:sz w:val="16"/>
-              </w:rPr>
-              <w:t>Answer matching review questions while the reading is fresh; later quiz/application/test prep.</w:t>
-            </w:r>
-          </w:p>
-        </w:tc>
-        <w:tc>
-          <w:tcPr>
-            <w:tcW w:type="dxa" w:w="5256"/>
+            <w:r>
+              <w:t>Answer aligned review items while notes and reading are fresh; use later quiz, application, presentations, and test preparation only when selected/assigned.</w:t>
+            </w:r>
+          </w:p>
+        </w:tc>
+        <w:tc>
+          <w:tcPr>
+            <w:tcW w:type="dxa" w:w="4795"/>
             <w:vAlign w:val="center"/>
           </w:tcPr>
           <w:p>
-            <w:pPr>
-              <w:spacing w:after="20"/>
-            </w:pPr>
-            <w:r>
-              <w:rPr>
-                <w:sz w:val="16"/>
-              </w:rPr>
-              <w:t>Use only the Chapter 2 review worksheet actually approved in Teams; use the teacher checks below until it exists.</w:t>
+            <w:r>
+              <w:t>Use p. 27 and teacher checks now; add assigned Chapter 2 work only after confirmation.</w:t>
             </w:r>
           </w:p>
         </w:tc>
@@ -457,13 +337,13 @@
     </w:p>
     <w:p>
       <w:r>
-        <w:rPr>
-          <w:b/>
-        </w:rPr>
-        <w:t xml:space="preserve">Source anchors  </w:t>
+        <w:t>Source anchors  Sep 14 SBTE pacing feedback 00:59:09–01:05:03; Sep 15 classroom files/notes/review 00:11:06–00:12:06 and 00:38:39–00:44:02; Sep 16 flashcard model 02:02:23–02:08:33; Sep 22 application/reading adjustment 00:06:14–00:07:59; Sep 24 quiz and vocabulary review 00:00:00–00:17:00; Sep 25 application/rubric decision 00:19:46–00:27:18; Sep 30 Chapter 2 planning 02:16:13–02:19:05.</w:t>
       </w:r>
+    </w:p>
+    <w:p>
+      <w:pPr/>
       <w:r>
-        <w:t>Sep 10 planning 01:29:44–01:34:55; Sep 14 class 00:37:59–00:46:08; Sep 15 class 00:11:06–00:12:06; Sep 16 Terms model 02:02:23–02:08:33; Sep 30 planning 02:16:13–02:19:05. Later Chapter 1 work also included a group application, vocabulary quiz, project work/presentations, and test preparation.</w:t>
+        <w:t>Later Chapter 1 refinement: Piter's group marketing-mix work and vocabulary review connected student examples to terms; the SBTE then selected the Chapter 1 application and 1–4 presentation rubric. These were Chapter 1 events, not Chapter 2 requirements. Block 1 and Block 5 varied in completion; use separate live stop records rather than assumed matching pages.</w:t>
       </w:r>
     </w:p>
     <w:p>
@@ -563,14 +443,8 @@
             <w:vAlign w:val="center"/>
           </w:tcPr>
           <w:p>
-            <w:pPr>
-              <w:spacing w:after="20"/>
-            </w:pPr>
-            <w:r>
-              <w:rPr>
-                <w:sz w:val="16"/>
-              </w:rPr>
-              <w:t>Use the authorized Chapter 2 file; post/confirm access through school Teams. Students save it in their Marketing course folder and reopen the saved copy.</w:t>
+            <w:r>
+              <w:t>Use the authorized Chapter 2 PDF. Confirm Teams availability before directing students to download it into their Marketing folder.</w:t>
             </w:r>
           </w:p>
         </w:tc>
@@ -616,14 +490,8 @@
             <w:vAlign w:val="center"/>
           </w:tcPr>
           <w:p>
-            <w:pPr>
-              <w:spacing w:after="20"/>
-            </w:pPr>
-            <w:r>
-              <w:rPr>
-                <w:sz w:val="16"/>
-              </w:rPr>
-              <w:t>Ask SBTE for its Chapter 2 teaching-notes PowerPoint, or prepare the same fill-in discussion format from the chapter headings. Do not present a new deck as already approved.</w:t>
+            <w:r>
+              <w:t>Confirm the SBTE's Chapter 2 notes. If none are supplied, use chapter headings as prompts; do not imply a new notes deck is assigned.</w:t>
             </w:r>
           </w:p>
         </w:tc>
@@ -669,14 +537,8 @@
             <w:vAlign w:val="center"/>
           </w:tcPr>
           <w:p>
-            <w:pPr>
-              <w:spacing w:after="20"/>
-            </w:pPr>
-            <w:r>
-              <w:rPr>
-                <w:sz w:val="16"/>
-              </w:rPr>
-              <w:t>Reuse the Chapter 1 PowerPoint flashcard directions/template; replace the word list with Chapter 2 terms in reading order. Model the first card.</w:t>
+            <w:r>
+              <w:t>If assigned, reuse the Chapter 1 digital-card format with Chapter 2 terms in encounter order. Model the first card.</w:t>
             </w:r>
           </w:p>
         </w:tc>
@@ -722,14 +584,8 @@
             <w:vAlign w:val="center"/>
           </w:tcPr>
           <w:p>
-            <w:pPr>
-              <w:spacing w:after="20"/>
-            </w:pPr>
-            <w:r>
-              <w:rPr>
-                <w:sz w:val="16"/>
-              </w:rPr>
-              <w:t>Confirm the actual Chapter 2 worksheet/questions and Teams assignment before naming question numbers or due dates.</w:t>
+            <w:r>
+              <w:t>Use p. 27 review prompts for planning; verify any separate worksheet and Teams assignment before citing its item numbers or due date.</w:t>
             </w:r>
           </w:p>
         </w:tc>
@@ -762,7 +618,7 @@
         <w:pStyle w:val="Heading1"/>
       </w:pPr>
       <w:r>
-        <w:t>Standing 42-minute route</w:t>
+        <w:t>Illustrative 42-minute route — adapt to the actual block</w:t>
       </w:r>
     </w:p>
     <w:tbl>
@@ -1061,14 +917,8 @@
             <w:vAlign w:val="center"/>
           </w:tcPr>
           <w:p>
-            <w:pPr>
-              <w:spacing w:after="20"/>
-            </w:pPr>
-            <w:r>
-              <w:rPr>
-                <w:sz w:val="16"/>
-              </w:rPr>
-              <w:t>Terms to Know or the aligned, approved review item; confer and check a sample.</w:t>
+            <w:r>
+              <w:t>If Chapter 2 Terms or review are approved, give work time and check a sample. Otherwise run the matching in-class term/review check.</w:t>
             </w:r>
           </w:p>
         </w:tc>
@@ -1078,14 +928,8 @@
             <w:vAlign w:val="center"/>
           </w:tcPr>
           <w:p>
-            <w:pPr>
-              <w:spacing w:after="20"/>
-            </w:pPr>
-            <w:r>
-              <w:rPr>
-                <w:sz w:val="16"/>
-              </w:rPr>
-              <w:t>Save a card or written response in the course folder.</w:t>
+            <w:r>
+              <w:t>Saved card or in-class term/review response.</w:t>
             </w:r>
           </w:p>
         </w:tc>
@@ -1204,24 +1048,12 @@
     </w:p>
     <w:p>
       <w:r>
-        <w:rPr>
-          <w:b/>
-        </w:rPr>
-        <w:t xml:space="preserve">If the opener runs long  </w:t>
-      </w:r>
-      <w:r>
-        <w:t>Stop it; do not compress away the reading. Shorten independent work and record the exact carry-over. This follows the Chapter 1 pacing correction.</w:t>
+        <w:t>If the opener or discussion runs long  Stop the opener at the agreed point; retain the actual reading/work stop. Chapter 1 sometimes deferred reading for group application, then resumed later. Do not falsely mark a planned segment complete.</w:t>
       </w:r>
     </w:p>
     <w:p>
       <w:r>
-        <w:rPr>
-          <w:b/>
-        </w:rPr>
-        <w:t xml:space="preserve">Terms in chapter order  </w:t>
-      </w:r>
-      <w:r>
-        <w:t>marketing plan (p. 18) → PEST analysis (p. 20) → SMART goal (p. 20) → customer profile (p. 24) → metrics (p. 26) → bibliography (p. 26). The p. 17 list is alphabetical; the Chapter 1 flashcards followed reading order.</w:t>
+        <w:t>Terms in Chapter 2 encounter order  marketing plan (p. 18) → PEST analysis (p. 20) → SMART goal (p. 20) → customer profile (p. 24) → metrics (p. 26) → bibliography (p. 26). The p. 17 key-term list is alphabetical; Chapter 1 cards followed reading order.</w:t>
       </w:r>
     </w:p>
     <w:p>
@@ -1571,14 +1403,8 @@
             <w:vAlign w:val="center"/>
           </w:tcPr>
           <w:p>
-            <w:pPr>
-              <w:spacing w:after="20"/>
-            </w:pPr>
-            <w:r>
-              <w:rPr>
-                <w:sz w:val="16"/>
-              </w:rPr>
-              <w:t>Model the first Terms to Know PowerPoint card for marketing plan: a meaningful picture, term shape with entrance animation, definition shape, and background. Students save in their Marketing folder.</w:t>
+            <w:r>
+              <w:t>Model the Chapter 1-style marketing-plan card (term/image before definition reveal) if the Chapter 2 task is approved. Otherwise model the term orally; record any unfinished file work.</w:t>
             </w:r>
           </w:p>
         </w:tc>
@@ -2081,14 +1907,8 @@
             <w:vAlign w:val="center"/>
           </w:tcPr>
           <w:p>
-            <w:pPr>
-              <w:spacing w:after="20"/>
-            </w:pPr>
-            <w:r>
-              <w:rPr>
-                <w:sz w:val="16"/>
-              </w:rPr>
-              <w:t>Add the PEST analysis Terms card. If the approved review worksheet exists, answer only the question(s) matched to pp. 19–20; otherwise classify one teacher-given internal/external example.</w:t>
+            <w:r>
+              <w:t>If assigned, add the PEST card and aligned review. Otherwise classify one internal and one external condition using Figure 2.1.</w:t>
             </w:r>
           </w:p>
         </w:tc>
@@ -2591,14 +2411,8 @@
             <w:vAlign w:val="center"/>
           </w:tcPr>
           <w:p>
-            <w:pPr>
-              <w:spacing w:after="20"/>
-            </w:pPr>
-            <w:r>
-              <w:rPr>
-                <w:sz w:val="16"/>
-              </w:rPr>
-              <w:t>Add the SMART goal Terms card. Students revise one vague goal into a checkable goal using a number and time. This is guided practice, not a newly assigned project.</w:t>
+            <w:r>
+              <w:t>If assigned, add the SMART goal card. As guided practice, revise one vague goal using a measurable result and time limit; no new project is implied.</w:t>
             </w:r>
           </w:p>
         </w:tc>
@@ -3611,14 +3425,8 @@
             <w:vAlign w:val="center"/>
           </w:tcPr>
           <w:p>
-            <w:pPr>
-              <w:spacing w:after="20"/>
-            </w:pPr>
-            <w:r>
-              <w:rPr>
-                <w:sz w:val="16"/>
-              </w:rPr>
-              <w:t>Add the customer profile Terms card. From a fictional scenario, write two useful customer details and one competitor question; no personal student data.</w:t>
+            <w:r>
+              <w:t>If assigned, add the customer-profile card. Use a fictional case to name two useful customer facts and one competitor question; avoid student personal data.</w:t>
             </w:r>
           </w:p>
         </w:tc>
@@ -4631,14 +4439,8 @@
             <w:vAlign w:val="center"/>
           </w:tcPr>
           <w:p>
-            <w:pPr>
-              <w:spacing w:after="20"/>
-            </w:pPr>
-            <w:r>
-              <w:rPr>
-                <w:sz w:val="16"/>
-              </w:rPr>
-              <w:t>Add metrics and bibliography Terms cards. Match one SMART goal to a metric and say what the result would tell the business.</w:t>
+            <w:r>
+              <w:t>If assigned, add metrics and bibliography cards. Match one goal to a metric and explain what the result shows.</w:t>
             </w:r>
           </w:p>
         </w:tc>
@@ -5141,14 +4943,8 @@
             <w:vAlign w:val="center"/>
           </w:tcPr>
           <w:p>
-            <w:pPr>
-              <w:spacing w:after="20"/>
-            </w:pPr>
-            <w:r>
-              <w:rPr>
-                <w:sz w:val="16"/>
-              </w:rPr>
-              <w:t>Finish six Terms cards; complete confirmed Chapter 2 review questions if available. If SBTE has scheduled a vocabulary quiz, administer the approved quiz; otherwise practice matching and explanation.</w:t>
+            <w:r>
+              <w:t>If Chapter 2 cards/review are assigned, finish them. If the SBTE confirms a vocabulary quiz, use the approved quiz; otherwise practice term matching and explanation.</w:t>
             </w:r>
           </w:p>
         </w:tc>
@@ -5327,24 +5123,12 @@
     </w:p>
     <w:p>
       <w:r>
-        <w:rPr>
-          <w:b/>
-        </w:rPr>
-        <w:t xml:space="preserve">Learning target  </w:t>
-      </w:r>
-      <w:r>
-        <w:t>Use Chapter 2 knowledge in one approved application before final assessment.</w:t>
+        <w:t>Learning target  Rehearse a textbook Chapter 2 application, or carry out the specific p. 27 task selected by the SBTE. This is not automatically graded.</w:t>
       </w:r>
     </w:p>
     <w:p>
       <w:r>
-        <w:rPr>
-          <w:b/>
-        </w:rPr>
-        <w:t xml:space="preserve">Connection / retrieval  </w:t>
-      </w:r>
-      <w:r>
-        <w:t>Chapter 1 added project work and presentations before the test; the SBTE said Chapter 2’s application type is to be selected after checking chapter length and timing.</w:t>
+        <w:t>Connection / retrieval  Chapter 1 moved from reading/review to selected application and presentations before its test. Which Chapter 2 application, if any, is assigned remains a separate SBTE decision.</w:t>
       </w:r>
     </w:p>
     <w:p>
@@ -5598,14 +5382,8 @@
             <w:vAlign w:val="center"/>
           </w:tcPr>
           <w:p>
-            <w:pPr>
-              <w:spacing w:after="20"/>
-            </w:pPr>
-            <w:r>
-              <w:rPr>
-                <w:sz w:val="16"/>
-              </w:rPr>
-              <w:t>Read the selected p. 27 prompt together. Reopen only the pages needed as evidence. For an ungraded rehearsal, use the p. 26 engineering-firm scenario to identify one external factor and one plan response.</w:t>
+            <w:r>
+              <w:t>Read only the selected p. 27 prompt if one is confirmed. Until then, use p. 26 Market This as an ungraded rehearsal and reopen the relevant source pages.</w:t>
             </w:r>
           </w:p>
         </w:tc>
@@ -5651,14 +5429,8 @@
             <w:vAlign w:val="center"/>
           </w:tcPr>
           <w:p>
-            <w:pPr>
-              <w:spacing w:after="20"/>
-            </w:pPr>
-            <w:r>
-              <w:rPr>
-                <w:sz w:val="16"/>
-              </w:rPr>
-              <w:t>If no task is selected yet: run the ungraded rehearsal and finish review. If a task is selected: display its exact deliverable, work time, success criteria, and confirmed Teams submission/date; model only the process, not students’ answers.</w:t>
+            <w:r>
+              <w:t>If no task is selected, finish the rehearsal/review. If selected, display the exact deliverable, time, criteria, and confirmed submission route; model process, not student answers.</w:t>
             </w:r>
           </w:p>
         </w:tc>
@@ -5794,13 +5566,7 @@
     </w:p>
     <w:p>
       <w:r>
-        <w:rPr>
-          <w:b/>
-        </w:rPr>
-        <w:t xml:space="preserve">Words to use at the transition  </w:t>
-      </w:r>
-      <w:r>
-        <w:t>“Today we apply the chapter. I will tell you exactly which p. 27 task is assigned after the SBTE confirms it. Until then, this is practice.”</w:t>
+        <w:t>Words to use at the transition  “We are practicing with the chapter. Once the SBTE chooses a p. 27 task, I will show you its exact directions.”</w:t>
       </w:r>
     </w:p>
     <w:p>
@@ -6499,12 +6265,12 @@
     </w:p>
     <w:p>
       <w:r>
-        <w:t>The 86-file local placement transcript inventory was screened for Chapter 1 planning, instruction, work, feedback, and assessment; the relevant dated passages were read against the actual Chapter 1 plans. Direct planning evidence: September 10 at 01:29:44–01:34:55 established opener → notes → reading → vocabulary → aligned review. September 30 at 02:16:13–02:19:05 explicitly asked for Chapter 2 to be laid out like Chapter 1 first, then reconsidered later. Classroom evidence: September 14 00:37:59–00:46:08 (files, terms, review, applications); September 15 00:11:06–00:12:06 (notes/read/review together); September 16 02:02:23–02:08:33 (flashcard model); September 22–24 (group application, notes completion, quiz/review); September 28–October 2 (application and presentations before the test). Chapter 2 PDF, printed pp. 17–27, controls the academic sequence and terminology.</w:t>
+        <w:t>Evidence scope and authority  Targeted Chapter 1-relevant local placement records were checked against classroom plans, the original Chapter 1 assignments, and the Chapter 2 textbook (printed pp. 17–27). The September 14–16 class records establish routine and file handling; September 22–25 records show group work, review/quiz, and selected applications; September 30 planning explicitly calls for a Chapter 1-style Chapter 2 layout before later improvement. The textbook controls Chapter 2 terminology, figures, page order, and p. 27 options. Planning conversations are not proof a Chapter 2 task was posted or completed.</w:t>
       </w:r>
     </w:p>
     <w:p>
       <w:r>
-        <w:t>Private classroom records were used only to reconstruct the process. This guide includes no student-identifying evidence and is a planning document, not a statement that Chapter 2 files or assignments have already been posted.</w:t>
+        <w:t>Source-state boundary  School/SBTE directions, observed Chapter 1 practice, Piter-created supports, later refinements, textbook requirements, and unresolved Chapter 2 decisions are kept distinct above. Private classroom evidence informed this de-identified guide; no student names or raw records are reproduced. Phase 2 improvement candidates — NOT part of baseline: revisit access supports, student agency, differentiated checks, and assessment design after independent review.</w:t>
       </w:r>
     </w:p>
     <w:sectPr>

</xml_diff>